<commit_message>
Add certificate status to takeaway instructions
</commit_message>
<xml_diff>
--- a/docassemble/MATC1ADivorceJointPetition/data/templates/jointpetitionfordivorce_next_steps.docx
+++ b/docassemble/MATC1ADivorceJointPetition/data/templates/jointpetitionfordivorce_next_steps.docx
@@ -233,6 +233,111 @@
           </w14:textOutline>
         </w:rPr>
         <w:t>now.</w:t>
+      </w:r>
+    </w:p>
+    <w:p>
+      <w:pPr>
+        <w:pStyle w:val="ListParagraph"/>
+        <w:numPr>
+          <w:ilvl w:val="0"/>
+          <w:numId w:val="7"/>
+        </w:numPr>
+        <w:suppressAutoHyphens/>
+        <w:snapToGrid w:val="0"/>
+        <w:rPr>
+          <w14:textOutline w14:w="9525" w14:cap="rnd" w14:cmpd="sng" w14:algn="ctr">
+            <w14:noFill/>
+            <w14:prstDash w14:val="solid"/>
+            <w14:bevel/>
+          </w14:textOutline>
+        </w:rPr>
+      </w:pPr>
+      <w:r>
+        <w:t>{%p if needs_late_marriage_certificate_motion %}</w:t>
+      </w:r>
+    </w:p>
+    <w:p>
+      <w:pPr>
+        <w:pStyle w:val="ListParagraph"/>
+        <w:numPr>
+          <w:ilvl w:val="0"/>
+          <w:numId w:val="7"/>
+        </w:numPr>
+        <w:suppressAutoHyphens/>
+        <w:snapToGrid w:val="0"/>
+        <w:rPr>
+          <w14:textOutline w14:w="9525" w14:cap="rnd" w14:cmpd="sng" w14:algn="ctr">
+            <w14:noFill/>
+            <w14:prstDash w14:val="solid"/>
+            <w14:bevel/>
+          </w14:textOutline>
+        </w:rPr>
+      </w:pPr>
+      <w:r>
+        <w:t>A joint motion to file your marriage certificate late is included in this packet. File it with your petition, then file the certified copy with the court as soon as you receive it.</w:t>
+      </w:r>
+    </w:p>
+    <w:p>
+      <w:pPr>
+        <w:pStyle w:val="ListParagraph"/>
+        <w:numPr>
+          <w:ilvl w:val="0"/>
+          <w:numId w:val="7"/>
+        </w:numPr>
+        <w:suppressAutoHyphens/>
+        <w:snapToGrid w:val="0"/>
+        <w:rPr>
+          <w14:textOutline w14:w="9525" w14:cap="rnd" w14:cmpd="sng" w14:algn="ctr">
+            <w14:noFill/>
+            <w14:prstDash w14:val="solid"/>
+            <w14:bevel/>
+          </w14:textOutline>
+        </w:rPr>
+      </w:pPr>
+      <w:r>
+        <w:t>{%p else %}</w:t>
+      </w:r>
+    </w:p>
+    <w:p>
+      <w:pPr>
+        <w:pStyle w:val="ListParagraph"/>
+        <w:numPr>
+          <w:ilvl w:val="0"/>
+          <w:numId w:val="7"/>
+        </w:numPr>
+        <w:suppressAutoHyphens/>
+        <w:snapToGrid w:val="0"/>
+        <w:rPr>
+          <w14:textOutline w14:w="9525" w14:cap="rnd" w14:cmpd="sng" w14:algn="ctr">
+            <w14:noFill/>
+            <w14:prstDash w14:val="solid"/>
+            <w14:bevel/>
+          </w14:textOutline>
+        </w:rPr>
+      </w:pPr>
+      <w:r>
+        <w:t>Your marriage certificate is included in this packet. Keep the certified original because the court may ask to see it at your hearing.</w:t>
+      </w:r>
+    </w:p>
+    <w:p>
+      <w:pPr>
+        <w:pStyle w:val="ListParagraph"/>
+        <w:numPr>
+          <w:ilvl w:val="0"/>
+          <w:numId w:val="7"/>
+        </w:numPr>
+        <w:suppressAutoHyphens/>
+        <w:snapToGrid w:val="0"/>
+        <w:rPr>
+          <w14:textOutline w14:w="9525" w14:cap="rnd" w14:cmpd="sng" w14:algn="ctr">
+            <w14:noFill/>
+            <w14:prstDash w14:val="solid"/>
+            <w14:bevel/>
+          </w14:textOutline>
+        </w:rPr>
+      </w:pPr>
+      <w:r>
+        <w:t>{%p endif %}</w:t>
       </w:r>
     </w:p>
     <w:p>

</xml_diff>